<commit_message>
fix: zerar offsets do anchor de assinatura para posicionamento direto
</commit_message>
<xml_diff>
--- a/backend/templates/ModeloTermo.docx
+++ b/backend/templates/ModeloTermo.docx
@@ -1760,6 +1760,55 @@
     <w:p>
       <w:pPr>
         <w:spacing w:after="153" w:line="259" w:lineRule="auto"/>
+        <w:ind w:left="4956" w:right="63" w:firstLine="708"/>
+        <w:jc w:val="center"/>
+      </w:pPr>
+    </w:p>
+    <w:p>
+      <w:pPr>
+        <w:spacing w:after="153" w:line="259" w:lineRule="auto"/>
+        <w:ind w:left="4956" w:right="63" w:firstLine="708"/>
+        <w:jc w:val="center"/>
+      </w:pPr>
+      <w:r>
+        <w:t>______________________________</w:t>
+      </w:r>
+    </w:p>
+    <w:p>
+      <w:pPr>
+        <w:spacing w:after="153" w:line="259" w:lineRule="auto"/>
+        <w:ind w:left="4956" w:right="63" w:firstLine="708"/>
+        <w:jc w:val="center"/>
+      </w:pPr>
+      <w:r>
+        <w:rPr>
+          <w:sz w:val="16"/>
+          <w:szCs w:val="16"/>
+        </w:rPr>
+        <w:t xml:space="preserve">{CPF}  </w:t>
+      </w:r>
+    </w:p>
+    <w:p>
+      <w:pPr>
+        <w:spacing w:after="153" w:line="259" w:lineRule="auto"/>
+        <w:ind w:left="4956" w:right="63" w:firstLine="708"/>
+        <w:jc w:val="center"/>
+        <w:rPr>
+          <w:sz w:val="20"/>
+          <w:szCs w:val="20"/>
+        </w:rPr>
+      </w:pPr>
+      <w:r>
+        <w:rPr>
+          <w:sz w:val="20"/>
+          <w:szCs w:val="20"/>
+        </w:rPr>
+        <w:t>Assinatura do Colaborador</w:t>
+      </w:r>
+    </w:p>
+    <w:p>
+      <w:pPr>
+        <w:spacing w:after="153" w:line="259" w:lineRule="auto"/>
         <w:ind w:left="708" w:right="63" w:firstLine="708"/>
         <w:jc w:val="right"/>
       </w:pPr>
@@ -1816,7 +1865,7 @@
           <w:sz w:val="16"/>
           <w:szCs w:val="16"/>
         </w:rPr>
-        <w:t>{CPF}</w:t>
+        <w:t xml:space="preserve"> </w:t>
       </w:r>
     </w:p>
     <w:p>

</xml_diff>

<commit_message>
fix: edita o modelo do termo em dockx
</commit_message>
<xml_diff>
--- a/backend/templates/ModeloTermo.docx
+++ b/backend/templates/ModeloTermo.docx
@@ -1759,14 +1759,34 @@
     </w:p>
     <w:p>
       <w:pPr>
-        <w:spacing w:after="153" w:line="259" w:lineRule="auto"/>
+        <w:spacing w:after="153" w:line="240" w:lineRule="auto"/>
         <w:ind w:left="4956" w:right="63" w:firstLine="708"/>
         <w:jc w:val="center"/>
       </w:pPr>
     </w:p>
     <w:p>
       <w:pPr>
-        <w:spacing w:after="153" w:line="259" w:lineRule="auto"/>
+        <w:spacing w:after="153" w:line="240" w:lineRule="auto"/>
+        <w:ind w:left="4956" w:right="63" w:firstLine="708"/>
+        <w:jc w:val="center"/>
+        <w:rPr>
+          <w:color w:val="FFFFFF" w:themeColor="background1"/>
+          <w:sz w:val="16"/>
+          <w:szCs w:val="16"/>
+        </w:rPr>
+      </w:pPr>
+      <w:r>
+        <w:rPr>
+          <w:color w:val="FFFFFF" w:themeColor="background1"/>
+          <w:sz w:val="16"/>
+          <w:szCs w:val="16"/>
+        </w:rPr>
+        <w:t>/sn1/</w:t>
+      </w:r>
+    </w:p>
+    <w:p>
+      <w:pPr>
+        <w:spacing w:after="153" w:line="240" w:lineRule="auto"/>
         <w:ind w:left="4956" w:right="63" w:firstLine="708"/>
         <w:jc w:val="center"/>
       </w:pPr>

</xml_diff>